<commit_message>
docs: add page-numbered reference template
</commit_message>
<xml_diff>
--- a/.github/pandoc/reference.docx
+++ b/.github/pandoc/reference.docx
@@ -1,6 +1,6 @@
 
 <file path=word/document.xml><?xml version="1.0" encoding="utf-8"?>
-<w:document xmlns:w="http://schemas.openxmlformats.org/wordprocessingml/2006/main" xmlns:m="http://schemas.openxmlformats.org/officeDocument/2006/math" xmlns:r="http://schemas.openxmlformats.org/officeDocument/2006/relationships" xmlns:o="urn:schemas-microsoft-com:office:office" xmlns:v="urn:schemas-microsoft-com:vml" xmlns:w10="urn:schemas-microsoft-com:office:word" xmlns:a="http://schemas.openxmlformats.org/drawingml/2006/main" xmlns:pic="http://schemas.openxmlformats.org/drawingml/2006/picture" xmlns:wp="http://schemas.openxmlformats.org/drawingml/2006/wordprocessingDrawing">
+<w:document xmlns:r="http://schemas.openxmlformats.org/officeDocument/2006/relationships" xmlns:w="http://schemas.openxmlformats.org/wordprocessingml/2006/main">
   <w:body>
     <w:p>
       <w:pPr>
@@ -381,6 +381,7 @@
       </w:r>
     </w:p>
     <w:sectPr>
+      <w:footerReference w:type="default" r:id="rId31"/>
       <w:footnotePr>
         <w:numRestart w:val="eachSect"/>
       </w:footnotePr>
@@ -391,6 +392,32 @@
 
 <file path=word/comments.xml><?xml version="1.0" encoding="utf-8"?>
 <w:comments xmlns:w="http://schemas.openxmlformats.org/wordprocessingml/2006/main" xmlns:m="http://schemas.openxmlformats.org/officeDocument/2006/math" xmlns:r="http://schemas.openxmlformats.org/officeDocument/2006/relationships" xmlns:o="urn:schemas-microsoft-com:office:office" xmlns:v="urn:schemas-microsoft-com:vml" xmlns:w10="urn:schemas-microsoft-com:office:word" xmlns:a="http://schemas.openxmlformats.org/drawingml/2006/main" xmlns:pic="http://schemas.openxmlformats.org/drawingml/2006/picture" xmlns:wp="http://schemas.openxmlformats.org/drawingml/2006/wordprocessingDrawing"/>
+</file>
+
+<file path=word/footer1.xml><?xml version="1.0" encoding="utf-8"?>
+<w:ftr xmlns:w="http://schemas.openxmlformats.org/wordprocessingml/2006/main">
+  <w:p>
+    <w:pPr>
+      <w:pStyle w:val="Footer"/>
+      <w:jc w:val="center"/>
+    </w:pPr>
+    <w:r>
+      <w:fldChar w:fldCharType="begin"/>
+    </w:r>
+    <w:r>
+      <w:instrText xml:space="preserve"> PAGE </w:instrText>
+    </w:r>
+    <w:r>
+      <w:fldChar w:fldCharType="separate"/>
+    </w:r>
+    <w:r>
+      <w:t>1</w:t>
+    </w:r>
+    <w:r>
+      <w:fldChar w:fldCharType="end"/>
+    </w:r>
+  </w:p>
+</w:ftr>
 </file>
 
 <file path=word/footnotes.xml><?xml version="1.0" encoding="utf-8"?>

</xml_diff>